<commit_message>
docs: drop the green highlight boxes, leave a plain bulleted list
The pale-green .change-note wrapper around "What's new" and the .new row
highlight converted into heavy shaded blocks in Word -- 58 shaded runs -- which
read as boxes rather than emphasis. Both rules are gone and the change notes now
stand as an ordinary bulleted list. No wording changed; the .docx is regenerated
from this HTML.
</commit_message>
<xml_diff>
--- a/docs/CoAlliance_Match_Key.docx
+++ b/docs/CoAlliance_Match_Key.docx
@@ -34,24 +34,18 @@
       <w:pPr>
         <w:pStyle w:val="TextBody"/>
         <w:bidi w:val="0"/>
-        <w:spacing w:before="150" w:after="150"/>
-        <w:ind w:left="150" w:right="150" w:hanging="0"/>
+        <w:spacing w:before="0" w:after="283"/>
         <w:jc w:val="left"/>
         <w:rPr/>
       </w:pPr>
       <w:r>
         <w:rPr>
           <w:rStyle w:val="StrongEmphasis"/>
-          <w:bdr w:val="single" w:sz="18" w:space="9" w:color="66BB66"/>
-          <w:shd w:fill="EEFFEE" w:val="clear"/>
         </w:rPr>
         <w:t>What's new in _v08142026:</w:t>
       </w:r>
       <w:r>
-        <w:rPr>
-          <w:bdr w:val="single" w:sz="18" w:space="9" w:color="66BB66"/>
-          <w:shd w:fill="EEFFEE" w:val="clear"/>
-        </w:rPr>
+        <w:rPr/>
         <w:t xml:space="preserve"> </w:t>
       </w:r>
     </w:p>
@@ -64,72 +58,52 @@
         </w:numPr>
         <w:tabs>
           <w:tab w:val="clear" w:pos="1134"/>
-          <w:tab w:val="left" w:pos="859" w:leader="none"/>
+          <w:tab w:val="left" w:pos="1009" w:leader="none"/>
         </w:tabs>
         <w:bidi w:val="0"/>
-        <w:spacing w:before="150" w:after="150"/>
-        <w:ind w:left="859" w:right="150" w:hanging="283"/>
+        <w:spacing w:before="0" w:after="0"/>
+        <w:ind w:left="1009" w:right="300" w:hanging="283"/>
         <w:jc w:val="left"/>
         <w:rPr/>
       </w:pPr>
       <w:r>
         <w:rPr>
           <w:rStyle w:val="StrongEmphasis"/>
-          <w:bdr w:val="single" w:sz="18" w:space="9" w:color="66BB66"/>
-          <w:shd w:fill="EEFFEE" w:val="clear"/>
         </w:rPr>
         <w:t>A Turkish capital İ no longer widens the key.</w:t>
       </w:r>
       <w:r>
-        <w:rPr>
-          <w:bdr w:val="single" w:sz="18" w:space="9" w:color="66BB66"/>
-          <w:shd w:fill="EEFFEE" w:val="clear"/>
-        </w:rPr>
+        <w:rPr/>
         <w:t xml:space="preserve"> The whole match key is converted to lowercase, and "İ" (U+0130) lowercases into </w:t>
       </w:r>
       <w:r>
         <w:rPr>
           <w:rStyle w:val="Emphasis"/>
-          <w:bdr w:val="single" w:sz="18" w:space="9" w:color="66BB66"/>
-          <w:shd w:fill="EEFFEE" w:val="clear"/>
         </w:rPr>
         <w:t>two</w:t>
       </w:r>
       <w:r>
-        <w:rPr>
-          <w:bdr w:val="single" w:sz="18" w:space="9" w:color="66BB66"/>
-          <w:shd w:fill="EEFFEE" w:val="clear"/>
-        </w:rPr>
+        <w:rPr/>
         <w:t xml:space="preserve"> characters — "i" plus a combining dot above. Each section used to be padded to its width </w:t>
       </w:r>
       <w:r>
         <w:rPr>
           <w:rStyle w:val="Emphasis"/>
-          <w:bdr w:val="single" w:sz="18" w:space="9" w:color="66BB66"/>
-          <w:shd w:fill="EEFFEE" w:val="clear"/>
         </w:rPr>
         <w:t>before</w:t>
       </w:r>
       <w:r>
-        <w:rPr>
-          <w:bdr w:val="single" w:sz="18" w:space="9" w:color="66BB66"/>
-          <w:shd w:fill="EEFFEE" w:val="clear"/>
-        </w:rPr>
+        <w:rPr/>
         <w:t xml:space="preserve"> that conversion, so an "İ" counted as one character while padding and took up two afterwards, pushing the key to 189, 190 or 191 characters. Sections are now converted to lowercase before they are padded, so widths are measured on the final characters. "İ" is the only character in Unicode whose lowercase form is longer than the original, so nothing else is affected. This reached the key through the </w:t>
       </w:r>
       <w:r>
         <w:rPr>
           <w:rStyle w:val="Emphasis"/>
-          <w:bdr w:val="single" w:sz="18" w:space="9" w:color="66BB66"/>
-          <w:shd w:fill="EEFFEE" w:val="clear"/>
         </w:rPr>
         <w:t>Publisher Name</w:t>
       </w:r>
       <w:r>
-        <w:rPr>
-          <w:bdr w:val="single" w:sz="18" w:space="9" w:color="66BB66"/>
-          <w:shd w:fill="EEFFEE" w:val="clear"/>
-        </w:rPr>
+        <w:rPr/>
         <w:t xml:space="preserve"> section and affected 10,575 of 39.4 million records, all Turkish or Ottoman. </w:t>
       </w:r>
     </w:p>
@@ -142,27 +116,22 @@
         </w:numPr>
         <w:tabs>
           <w:tab w:val="clear" w:pos="1134"/>
-          <w:tab w:val="left" w:pos="859" w:leader="none"/>
+          <w:tab w:val="left" w:pos="1009" w:leader="none"/>
         </w:tabs>
         <w:bidi w:val="0"/>
-        <w:spacing w:before="150" w:after="150"/>
-        <w:ind w:left="859" w:right="150" w:hanging="283"/>
+        <w:spacing w:before="0" w:after="0"/>
+        <w:ind w:left="1009" w:right="300" w:hanging="283"/>
         <w:jc w:val="left"/>
         <w:rPr/>
       </w:pPr>
       <w:r>
         <w:rPr>
           <w:rStyle w:val="StrongEmphasis"/>
-          <w:bdr w:val="single" w:sz="18" w:space="9" w:color="66BB66"/>
-          <w:shd w:fill="EEFFEE" w:val="clear"/>
         </w:rPr>
         <w:t>The publication year of a government document is validated before it is used.</w:t>
       </w:r>
       <w:r>
-        <w:rPr>
-          <w:bdr w:val="single" w:sz="18" w:space="9" w:color="66BB66"/>
-          <w:shd w:fill="EEFFEE" w:val="clear"/>
-        </w:rPr>
+        <w:rPr/>
         <w:t xml:space="preserve"> When an 086 $a was present, the year was taken from control field 008 characters 7–10 without any of the checks applied elsewhere. A malformed value there produced a 2- or 3-character year and shortened the whole key, and the placeholder "9999" (unknown year) was used as though it were a real year even when characters 11–14 held a valid one. That second case produced a normal-length key that quietly could not match — the same record without an 086 got the right year. Government documents still prefer characters 7–10, but only when that value is a real year. </w:t>
       </w:r>
     </w:p>
@@ -175,22 +144,16 @@
         </w:numPr>
         <w:tabs>
           <w:tab w:val="clear" w:pos="1134"/>
-          <w:tab w:val="left" w:pos="859" w:leader="none"/>
+          <w:tab w:val="left" w:pos="1009" w:leader="none"/>
         </w:tabs>
         <w:bidi w:val="0"/>
-        <w:spacing w:before="150" w:after="150"/>
-        <w:ind w:left="859" w:right="150" w:hanging="283"/>
-        <w:jc w:val="left"/>
-        <w:rPr>
-          <w:bdr w:val="single" w:sz="18" w:space="9" w:color="66BB66"/>
-          <w:shd w:fill="EEFFEE" w:val="clear"/>
-        </w:rPr>
-      </w:pPr>
-      <w:r>
-        <w:rPr>
-          <w:bdr w:val="single" w:sz="18" w:space="9" w:color="66BB66"/>
-          <w:shd w:fill="EEFFEE" w:val="clear"/>
-        </w:rPr>
+        <w:spacing w:before="0" w:after="0"/>
+        <w:ind w:left="1009" w:right="300" w:hanging="283"/>
+        <w:jc w:val="left"/>
+        <w:rPr/>
+      </w:pPr>
+      <w:r>
+        <w:rPr/>
         <w:t xml:space="preserve">Both were reported by Ed Summers (Stanford University Libraries / POD) from the same 39.4 million record corpus that produced the _v07312026 fixes. </w:t>
       </w:r>
     </w:p>
@@ -203,64 +166,45 @@
         </w:numPr>
         <w:tabs>
           <w:tab w:val="clear" w:pos="1134"/>
-          <w:tab w:val="left" w:pos="859" w:leader="none"/>
+          <w:tab w:val="left" w:pos="1009" w:leader="none"/>
         </w:tabs>
         <w:bidi w:val="0"/>
-        <w:spacing w:before="150" w:after="150"/>
-        <w:ind w:left="859" w:right="150" w:hanging="283"/>
-        <w:jc w:val="left"/>
-        <w:rPr/>
-      </w:pPr>
-      <w:r>
-        <w:rPr>
-          <w:bdr w:val="single" w:sz="18" w:space="9" w:color="66BB66"/>
-          <w:shd w:fill="EEFFEE" w:val="clear"/>
-        </w:rPr>
+        <w:ind w:left="1009" w:right="300" w:hanging="283"/>
+        <w:jc w:val="left"/>
+        <w:rPr/>
+      </w:pPr>
+      <w:r>
+        <w:rPr/>
         <w:t xml:space="preserve">A key ending in </w:t>
       </w:r>
       <w:r>
         <w:rPr>
           <w:rStyle w:val="SourceText"/>
-          <w:bdr w:val="single" w:sz="18" w:space="9" w:color="66BB66"/>
-          <w:shd w:fill="EEFFEE" w:val="clear"/>
         </w:rPr>
         <w:t>_v07312026</w:t>
       </w:r>
       <w:r>
-        <w:rPr>
-          <w:bdr w:val="single" w:sz="18" w:space="9" w:color="66BB66"/>
-          <w:shd w:fill="EEFFEE" w:val="clear"/>
-        </w:rPr>
+        <w:rPr/>
         <w:t xml:space="preserve"> is </w:t>
       </w:r>
       <w:r>
         <w:rPr>
           <w:rStyle w:val="StrongEmphasis"/>
-          <w:bdr w:val="single" w:sz="18" w:space="9" w:color="66BB66"/>
-          <w:shd w:fill="EEFFEE" w:val="clear"/>
         </w:rPr>
         <w:t>not</w:t>
       </w:r>
       <w:r>
-        <w:rPr>
-          <w:bdr w:val="single" w:sz="18" w:space="9" w:color="66BB66"/>
-          <w:shd w:fill="EEFFEE" w:val="clear"/>
-        </w:rPr>
+        <w:rPr/>
         <w:t xml:space="preserve"> comparable to one ending in </w:t>
       </w:r>
       <w:r>
         <w:rPr>
           <w:rStyle w:val="SourceText"/>
-          <w:bdr w:val="single" w:sz="18" w:space="9" w:color="66BB66"/>
-          <w:shd w:fill="EEFFEE" w:val="clear"/>
         </w:rPr>
         <w:t>_v08142026</w:t>
       </w:r>
       <w:r>
-        <w:rPr>
-          <w:bdr w:val="single" w:sz="18" w:space="9" w:color="66BB66"/>
-          <w:shd w:fill="EEFFEE" w:val="clear"/>
-        </w:rPr>
+        <w:rPr/>
         <w:t xml:space="preserve"> for government documents or for records whose publisher contains "İ". All other records produce the same key under both versions. Records must be reindexed to carry the new key. </w:t>
       </w:r>
     </w:p>
@@ -268,24 +212,17 @@
       <w:pPr>
         <w:pStyle w:val="TextBody"/>
         <w:bidi w:val="0"/>
-        <w:spacing w:before="150" w:after="150"/>
-        <w:ind w:left="150" w:right="150" w:hanging="0"/>
         <w:jc w:val="left"/>
         <w:rPr/>
       </w:pPr>
       <w:r>
         <w:rPr>
           <w:rStyle w:val="StrongEmphasis"/>
-          <w:bdr w:val="single" w:sz="18" w:space="9" w:color="66BB66"/>
-          <w:shd w:fill="EEFFEE" w:val="clear"/>
         </w:rPr>
         <w:t>Previous version changes (07-31-26):</w:t>
       </w:r>
       <w:r>
-        <w:rPr>
-          <w:bdr w:val="single" w:sz="18" w:space="9" w:color="66BB66"/>
-          <w:shd w:fill="EEFFEE" w:val="clear"/>
-        </w:rPr>
+        <w:rPr/>
         <w:t xml:space="preserve"> </w:t>
       </w:r>
     </w:p>
@@ -298,27 +235,22 @@
         </w:numPr>
         <w:tabs>
           <w:tab w:val="clear" w:pos="1134"/>
-          <w:tab w:val="left" w:pos="859" w:leader="none"/>
+          <w:tab w:val="left" w:pos="1009" w:leader="none"/>
         </w:tabs>
         <w:bidi w:val="0"/>
-        <w:spacing w:before="150" w:after="150"/>
-        <w:ind w:left="859" w:right="150" w:hanging="283"/>
+        <w:spacing w:before="0" w:after="0"/>
+        <w:ind w:left="1009" w:right="300" w:hanging="283"/>
         <w:jc w:val="left"/>
         <w:rPr/>
       </w:pPr>
       <w:r>
         <w:rPr>
           <w:rStyle w:val="StrongEmphasis"/>
-          <w:bdr w:val="single" w:sz="18" w:space="9" w:color="66BB66"/>
-          <w:shd w:fill="EEFFEE" w:val="clear"/>
         </w:rPr>
         <w:t>Every match key is now exactly 188 characters.</w:t>
       </w:r>
       <w:r>
-        <w:rPr>
-          <w:bdr w:val="single" w:sz="18" w:space="9" w:color="66BB66"/>
-          <w:shd w:fill="EEFFEE" w:val="clear"/>
-        </w:rPr>
+        <w:rPr/>
         <w:t xml:space="preserve"> Two sections could previously collapse to zero width instead of being padded, which produced short keys of 188, 183, 93 or 88 characters: </w:t>
       </w:r>
     </w:p>
@@ -331,27 +263,22 @@
         </w:numPr>
         <w:tabs>
           <w:tab w:val="clear" w:pos="1134"/>
-          <w:tab w:val="left" w:pos="1568" w:leader="none"/>
+          <w:tab w:val="left" w:pos="1718" w:leader="none"/>
         </w:tabs>
         <w:bidi w:val="0"/>
-        <w:spacing w:before="150" w:after="150"/>
-        <w:ind w:left="1568" w:right="150" w:hanging="283"/>
+        <w:spacing w:before="0" w:after="0"/>
+        <w:ind w:left="1718" w:right="300" w:hanging="283"/>
         <w:jc w:val="left"/>
         <w:rPr/>
       </w:pPr>
       <w:r>
         <w:rPr>
           <w:rStyle w:val="Emphasis"/>
-          <w:bdr w:val="single" w:sz="18" w:space="9" w:color="66BB66"/>
-          <w:shd w:fill="EEFFEE" w:val="clear"/>
         </w:rPr>
         <w:t>Title</w:t>
       </w:r>
       <w:r>
-        <w:rPr>
-          <w:bdr w:val="single" w:sz="18" w:space="9" w:color="66BB66"/>
-          <w:shd w:fill="EEFFEE" w:val="clear"/>
-        </w:rPr>
+        <w:rPr/>
         <w:t xml:space="preserve"> — a record with no 245 field at all (for example a MARC holdings record, Leader/06 = 'x') emitted nothing instead of 95 underscores. </w:t>
       </w:r>
     </w:p>
@@ -364,27 +291,22 @@
         </w:numPr>
         <w:tabs>
           <w:tab w:val="clear" w:pos="1134"/>
-          <w:tab w:val="left" w:pos="1568" w:leader="none"/>
+          <w:tab w:val="left" w:pos="1718" w:leader="none"/>
         </w:tabs>
         <w:bidi w:val="0"/>
-        <w:spacing w:before="150" w:after="150"/>
-        <w:ind w:left="1568" w:right="150" w:hanging="283"/>
+        <w:spacing w:before="0" w:after="0"/>
+        <w:ind w:left="1718" w:right="300" w:hanging="283"/>
         <w:jc w:val="left"/>
         <w:rPr/>
       </w:pPr>
       <w:r>
         <w:rPr>
           <w:rStyle w:val="Emphasis"/>
-          <w:bdr w:val="single" w:sz="18" w:space="9" w:color="66BB66"/>
-          <w:shd w:fill="EEFFEE" w:val="clear"/>
         </w:rPr>
         <w:t>Publisher Name</w:t>
       </w:r>
       <w:r>
-        <w:rPr>
-          <w:bdr w:val="single" w:sz="18" w:space="9" w:color="66BB66"/>
-          <w:shd w:fill="EEFFEE" w:val="clear"/>
-        </w:rPr>
+        <w:rPr/>
         <w:t xml:space="preserve"> — a record with no 264 $b and no 260 $b emitted nothing instead of 5 underscores. </w:t>
       </w:r>
     </w:p>
@@ -396,33 +318,25 @@
           <w:numId w:val="0"/>
         </w:numPr>
         <w:bidi w:val="0"/>
-        <w:spacing w:before="150" w:after="150"/>
-        <w:ind w:left="150" w:right="150" w:hanging="0"/>
-        <w:jc w:val="left"/>
-        <w:rPr/>
-      </w:pPr>
-      <w:r>
-        <w:rPr>
-          <w:bdr w:val="single" w:sz="18" w:space="9" w:color="66BB66"/>
-          <w:shd w:fill="EEFFEE" w:val="clear"/>
-        </w:rPr>
+        <w:spacing w:before="0" w:after="0"/>
+        <w:ind w:left="300" w:right="300" w:hanging="0"/>
+        <w:jc w:val="left"/>
+        <w:rPr/>
+      </w:pPr>
+      <w:r>
+        <w:rPr/>
         <w:t>Both cases now pad to their full section width, as this document has always specified. Reported by Ed Summers (Stanford University Libraries / POD), who found that 7% of 39 million records produced off-length keys (</w:t>
       </w:r>
       <w:hyperlink r:id="rId2">
         <w:r>
           <w:rPr>
             <w:rStyle w:val="InternetLink"/>
-            <w:bdr w:val="single" w:sz="18" w:space="9" w:color="66BB66"/>
-            <w:shd w:fill="EEFFEE" w:val="clear"/>
           </w:rPr>
           <w:t>issue #1</w:t>
         </w:r>
       </w:hyperlink>
       <w:r>
-        <w:rPr>
-          <w:bdr w:val="single" w:sz="18" w:space="9" w:color="66BB66"/>
-          <w:shd w:fill="EEFFEE" w:val="clear"/>
-        </w:rPr>
+        <w:rPr/>
         <w:t xml:space="preserve">). </w:t>
       </w:r>
     </w:p>
@@ -435,64 +349,45 @@
         </w:numPr>
         <w:tabs>
           <w:tab w:val="clear" w:pos="1134"/>
-          <w:tab w:val="left" w:pos="859" w:leader="none"/>
+          <w:tab w:val="left" w:pos="1009" w:leader="none"/>
         </w:tabs>
         <w:bidi w:val="0"/>
-        <w:spacing w:before="150" w:after="150"/>
-        <w:ind w:left="859" w:right="150" w:hanging="283"/>
-        <w:jc w:val="left"/>
-        <w:rPr/>
-      </w:pPr>
-      <w:r>
-        <w:rPr>
-          <w:bdr w:val="single" w:sz="18" w:space="9" w:color="66BB66"/>
-          <w:shd w:fill="EEFFEE" w:val="clear"/>
-        </w:rPr>
+        <w:ind w:left="1009" w:right="300" w:hanging="283"/>
+        <w:jc w:val="left"/>
+        <w:rPr/>
+      </w:pPr>
+      <w:r>
+        <w:rPr/>
         <w:t xml:space="preserve">A key ending in </w:t>
       </w:r>
       <w:r>
         <w:rPr>
           <w:rStyle w:val="SourceText"/>
-          <w:bdr w:val="single" w:sz="18" w:space="9" w:color="66BB66"/>
-          <w:shd w:fill="EEFFEE" w:val="clear"/>
         </w:rPr>
         <w:t>_v03182026</w:t>
       </w:r>
       <w:r>
-        <w:rPr>
-          <w:bdr w:val="single" w:sz="18" w:space="9" w:color="66BB66"/>
-          <w:shd w:fill="EEFFEE" w:val="clear"/>
-        </w:rPr>
+        <w:rPr/>
         <w:t xml:space="preserve"> is </w:t>
       </w:r>
       <w:r>
         <w:rPr>
           <w:rStyle w:val="StrongEmphasis"/>
-          <w:bdr w:val="single" w:sz="18" w:space="9" w:color="66BB66"/>
-          <w:shd w:fill="EEFFEE" w:val="clear"/>
         </w:rPr>
         <w:t>not</w:t>
       </w:r>
       <w:r>
-        <w:rPr>
-          <w:bdr w:val="single" w:sz="18" w:space="9" w:color="66BB66"/>
-          <w:shd w:fill="EEFFEE" w:val="clear"/>
-        </w:rPr>
+        <w:rPr/>
         <w:t xml:space="preserve"> comparable to one ending in </w:t>
       </w:r>
       <w:r>
         <w:rPr>
           <w:rStyle w:val="SourceText"/>
-          <w:bdr w:val="single" w:sz="18" w:space="9" w:color="66BB66"/>
-          <w:shd w:fill="EEFFEE" w:val="clear"/>
         </w:rPr>
         <w:t>_v07312026</w:t>
       </w:r>
       <w:r>
-        <w:rPr>
-          <w:bdr w:val="single" w:sz="18" w:space="9" w:color="66BB66"/>
-          <w:shd w:fill="EEFFEE" w:val="clear"/>
-        </w:rPr>
+        <w:rPr/>
         <w:t xml:space="preserve"> for records that lack a 245 or a publisher. Records must be reindexed to carry the new key. </w:t>
       </w:r>
     </w:p>
@@ -500,24 +395,17 @@
       <w:pPr>
         <w:pStyle w:val="TextBody"/>
         <w:bidi w:val="0"/>
-        <w:spacing w:before="150" w:after="150"/>
-        <w:ind w:left="150" w:right="150" w:hanging="0"/>
         <w:jc w:val="left"/>
         <w:rPr/>
       </w:pPr>
       <w:r>
         <w:rPr>
           <w:rStyle w:val="StrongEmphasis"/>
-          <w:bdr w:val="single" w:sz="18" w:space="9" w:color="66BB66"/>
-          <w:shd w:fill="EEFFEE" w:val="clear"/>
         </w:rPr>
         <w:t>Previous version changes (03-18-26):</w:t>
       </w:r>
       <w:r>
-        <w:rPr>
-          <w:bdr w:val="single" w:sz="18" w:space="9" w:color="66BB66"/>
-          <w:shd w:fill="EEFFEE" w:val="clear"/>
-        </w:rPr>
+        <w:rPr/>
         <w:t xml:space="preserve"> </w:t>
       </w:r>
     </w:p>
@@ -530,34 +418,25 @@
         </w:numPr>
         <w:tabs>
           <w:tab w:val="clear" w:pos="1134"/>
-          <w:tab w:val="left" w:pos="859" w:leader="none"/>
+          <w:tab w:val="left" w:pos="1009" w:leader="none"/>
         </w:tabs>
         <w:bidi w:val="0"/>
-        <w:spacing w:before="150" w:after="150"/>
-        <w:ind w:left="859" w:right="150" w:hanging="283"/>
-        <w:jc w:val="left"/>
-        <w:rPr/>
-      </w:pPr>
-      <w:r>
-        <w:rPr>
-          <w:bdr w:val="single" w:sz="18" w:space="9" w:color="66BB66"/>
-          <w:shd w:fill="EEFFEE" w:val="clear"/>
-        </w:rPr>
+        <w:ind w:left="1009" w:right="300" w:hanging="283"/>
+        <w:jc w:val="left"/>
+        <w:rPr/>
+      </w:pPr>
+      <w:r>
+        <w:rPr/>
         <w:t xml:space="preserve">A version string </w:t>
       </w:r>
       <w:r>
         <w:rPr>
           <w:rStyle w:val="SourceText"/>
-          <w:bdr w:val="single" w:sz="18" w:space="9" w:color="66BB66"/>
-          <w:shd w:fill="EEFFEE" w:val="clear"/>
         </w:rPr>
         <w:t>_v03182026</w:t>
       </w:r>
       <w:r>
-        <w:rPr>
-          <w:bdr w:val="single" w:sz="18" w:space="9" w:color="66BB66"/>
-          <w:shd w:fill="EEFFEE" w:val="clear"/>
-        </w:rPr>
+        <w:rPr/>
         <w:t xml:space="preserve"> is now appended to the matchkey just before the format character. This allows the system to distinguish which algorithm version produced a given matchkey in the Solr index. </w:t>
       </w:r>
     </w:p>
@@ -565,24 +444,17 @@
       <w:pPr>
         <w:pStyle w:val="TextBody"/>
         <w:bidi w:val="0"/>
-        <w:spacing w:before="150" w:after="150"/>
-        <w:ind w:left="150" w:right="150" w:hanging="0"/>
         <w:jc w:val="left"/>
         <w:rPr/>
       </w:pPr>
       <w:r>
         <w:rPr>
           <w:rStyle w:val="StrongEmphasis"/>
-          <w:bdr w:val="single" w:sz="18" w:space="9" w:color="66BB66"/>
-          <w:shd w:fill="EEFFEE" w:val="clear"/>
         </w:rPr>
         <w:t>Previous version changes (02-03-26):</w:t>
       </w:r>
       <w:r>
-        <w:rPr>
-          <w:bdr w:val="single" w:sz="18" w:space="9" w:color="66BB66"/>
-          <w:shd w:fill="EEFFEE" w:val="clear"/>
-        </w:rPr>
+        <w:rPr/>
         <w:t xml:space="preserve"> </w:t>
       </w:r>
     </w:p>
@@ -595,22 +467,16 @@
         </w:numPr>
         <w:tabs>
           <w:tab w:val="clear" w:pos="1134"/>
-          <w:tab w:val="left" w:pos="859" w:leader="none"/>
+          <w:tab w:val="left" w:pos="1009" w:leader="none"/>
         </w:tabs>
         <w:bidi w:val="0"/>
-        <w:spacing w:before="150" w:after="150"/>
-        <w:ind w:left="859" w:right="150" w:hanging="283"/>
-        <w:jc w:val="left"/>
-        <w:rPr>
-          <w:bdr w:val="single" w:sz="18" w:space="9" w:color="66BB66"/>
-          <w:shd w:fill="EEFFEE" w:val="clear"/>
-        </w:rPr>
-      </w:pPr>
-      <w:r>
-        <w:rPr>
-          <w:bdr w:val="single" w:sz="18" w:space="9" w:color="66BB66"/>
-          <w:shd w:fill="EEFFEE" w:val="clear"/>
-        </w:rPr>
+        <w:spacing w:before="0" w:after="0"/>
+        <w:ind w:left="1009" w:right="300" w:hanging="283"/>
+        <w:jc w:val="left"/>
+        <w:rPr/>
+      </w:pPr>
+      <w:r>
+        <w:rPr/>
         <w:t xml:space="preserve">Title field expanded from 70 to 95 characters. </w:t>
       </w:r>
     </w:p>
@@ -623,22 +489,15 @@
         </w:numPr>
         <w:tabs>
           <w:tab w:val="clear" w:pos="1134"/>
-          <w:tab w:val="left" w:pos="859" w:leader="none"/>
+          <w:tab w:val="left" w:pos="1009" w:leader="none"/>
         </w:tabs>
         <w:bidi w:val="0"/>
-        <w:spacing w:before="150" w:after="150"/>
-        <w:ind w:left="859" w:right="150" w:hanging="283"/>
-        <w:jc w:val="left"/>
-        <w:rPr>
-          <w:bdr w:val="single" w:sz="18" w:space="9" w:color="66BB66"/>
-          <w:shd w:fill="EEFFEE" w:val="clear"/>
-        </w:rPr>
-      </w:pPr>
-      <w:r>
-        <w:rPr>
-          <w:bdr w:val="single" w:sz="18" w:space="9" w:color="66BB66"/>
-          <w:shd w:fill="EEFFEE" w:val="clear"/>
-        </w:rPr>
+        <w:ind w:left="1009" w:right="300" w:hanging="283"/>
+        <w:jc w:val="left"/>
+        <w:rPr/>
+      </w:pPr>
+      <w:r>
+        <w:rPr/>
         <w:t xml:space="preserve">Government Document Number (086 $a) removed for HATHI compatibility. </w:t>
       </w:r>
     </w:p>
@@ -646,7 +505,6 @@
       <w:pPr>
         <w:pStyle w:val="TextBody"/>
         <w:bidi w:val="0"/>
-        <w:ind w:left="150" w:right="150" w:hanging="0"/>
         <w:jc w:val="left"/>
         <w:rPr/>
       </w:pPr>
@@ -1009,9 +867,9 @@
     </w:p>
     <w:p>
       <w:pPr>
-        <w:pStyle w:val="TextBodynew"/>
-        <w:shd w:fill="EEFFEE" w:val="clear"/>
-        <w:bidi w:val="0"/>
+        <w:pStyle w:val="TextBody"/>
+        <w:bidi w:val="0"/>
+        <w:spacing w:before="0" w:after="283"/>
         <w:jc w:val="left"/>
         <w:rPr/>
       </w:pPr>
@@ -2234,7 +2092,6 @@
           <w:tcPr>
             <w:tcW w:w="1111" w:type="dxa"/>
             <w:tcBorders/>
-            <w:shd w:fill="EEFFEE" w:val="clear"/>
             <w:vAlign w:val="center"/>
           </w:tcPr>
           <w:p>
@@ -2255,7 +2112,6 @@
           <w:tcPr>
             <w:tcW w:w="2076" w:type="dxa"/>
             <w:tcBorders/>
-            <w:shd w:fill="EEFFEE" w:val="clear"/>
             <w:vAlign w:val="center"/>
           </w:tcPr>
           <w:p>
@@ -2276,7 +2132,6 @@
           <w:tcPr>
             <w:tcW w:w="1645" w:type="dxa"/>
             <w:tcBorders/>
-            <w:shd w:fill="EEFFEE" w:val="clear"/>
             <w:vAlign w:val="center"/>
           </w:tcPr>
           <w:p>
@@ -2297,7 +2152,6 @@
           <w:tcPr>
             <w:tcW w:w="7711" w:type="dxa"/>
             <w:tcBorders/>
-            <w:shd w:fill="EEFFEE" w:val="clear"/>
             <w:vAlign w:val="center"/>
           </w:tcPr>
           <w:p>
@@ -4289,7 +4143,6 @@
           <w:tcPr>
             <w:tcW w:w="1771" w:type="dxa"/>
             <w:tcBorders/>
-            <w:shd w:fill="EEFFEE" w:val="clear"/>
             <w:vAlign w:val="center"/>
           </w:tcPr>
           <w:p>
@@ -4310,7 +4163,6 @@
           <w:tcPr>
             <w:tcW w:w="1096" w:type="dxa"/>
             <w:tcBorders/>
-            <w:shd w:fill="EEFFEE" w:val="clear"/>
             <w:vAlign w:val="center"/>
           </w:tcPr>
           <w:p>
@@ -4331,7 +4183,6 @@
           <w:tcPr>
             <w:tcW w:w="9451" w:type="dxa"/>
             <w:tcBorders/>
-            <w:shd w:fill="EEFFEE" w:val="clear"/>
             <w:vAlign w:val="center"/>
           </w:tcPr>
           <w:p>
@@ -5641,15 +5492,6 @@
       <w:color w:val="999999"/>
     </w:rPr>
   </w:style>
-  <w:style w:type="paragraph" w:styleId="TextBodynew">
-    <w:name w:val="Text Body.new"/>
-    <w:basedOn w:val="TextBody"/>
-    <w:qFormat/>
-    <w:pPr>
-      <w:shd w:fill="EEFFEE" w:val="clear"/>
-    </w:pPr>
-    <w:rPr/>
-  </w:style>
   <w:style w:type="paragraph" w:styleId="TableHeading">
     <w:name w:val="Table Heading"/>
     <w:basedOn w:val="TableContents"/>

</xml_diff>